<commit_message>
CN Notes: review pass on M12-M14 (all verified; 3 precision nits fixed)
Three audits verified M12-M14: SDN/OpenFlow/NFV, CDN/anycast, L4-vs-L7, VPC/VXLAN,
QUIC/HTTP-3; request path, REST/gRPC/queues, 8 fallacies, reliability patterns,
latency ladder, CAP; spine-leaf, RDMA/RoCE/InfiniBand, NVLink, ring all-reduce -
all correct. Precision fixes:
- M13 latency ladder: split L1(~1ns)/L2(~5ns).
- M14: spine-leaf 'at most 2 hops' (same-leaf = 1 hop); NVLink '~TB/s (NVSwitch aggregate)'.
</commit_message>
<xml_diff>
--- a/SITP/CN/Notes/M14_AI_DataCenter_Networking.docx
+++ b/SITP/CN/Notes/M14_AI_DataCenter_Networking.docx
@@ -962,20 +962,45 @@
         <w:t xml:space="preserve"> </w:t>
       </w:r>
       <w:r>
-        <w:t xml:space="preserve">— the</w:t>
-      </w:r>
-      <w:r>
-        <w:t xml:space="preserve"> </w:t>
-      </w:r>
-      <w:r>
-        <w:rPr>
-          <w:b/>
-          <w:bCs/>
-        </w:rPr>
-        <w:t xml:space="preserve">same 2 hops</w:t>
-      </w:r>
-      <w:r>
-        <w:t xml:space="preserve">, giving</w:t>
+        <w:t xml:space="preserve">—</w:t>
+      </w:r>
+      <w:r>
+        <w:t xml:space="preserve"> </w:t>
+      </w:r>
+      <w:r>
+        <w:rPr>
+          <w:b/>
+          <w:bCs/>
+        </w:rPr>
+        <w:t xml:space="preserve">at most 2 hops</w:t>
+      </w:r>
+      <w:r>
+        <w:t xml:space="preserve"> </w:t>
+      </w:r>
+      <w:r>
+        <w:t xml:space="preserve">(two servers under the</w:t>
+      </w:r>
+      <w:r>
+        <w:t xml:space="preserve"> </w:t>
+      </w:r>
+      <w:r>
+        <w:rPr>
+          <w:i/>
+          <w:iCs/>
+        </w:rPr>
+        <w:t xml:space="preserve">same</w:t>
+      </w:r>
+      <w:r>
+        <w:t xml:space="preserve"> </w:t>
+      </w:r>
+      <w:r>
+        <w:t xml:space="preserve">leaf are just 1 hop),</w:t>
+      </w:r>
+      <w:r>
+        <w:t xml:space="preserve"> </w:t>
+      </w:r>
+      <w:r>
+        <w:t xml:space="preserve">giving</w:t>
       </w:r>
       <w:r>
         <w:t xml:space="preserve"> </w:t>
@@ -1620,20 +1645,23 @@
         <w:t xml:space="preserve"> </w:t>
       </w:r>
       <w:r>
-        <w:t xml:space="preserve">connect GPUs directly at</w:t>
-      </w:r>
-      <w:r>
-        <w:t xml:space="preserve"> </w:t>
-      </w:r>
-      <w:r>
-        <w:rPr>
-          <w:b/>
-          <w:bCs/>
-        </w:rPr>
-        <w:t xml:space="preserve">TB/s</w:t>
-      </w:r>
-      <w:r>
-        <w:t xml:space="preserve">, far</w:t>
+        <w:t xml:space="preserve">connect GPUs directly at up to</w:t>
+      </w:r>
+      <w:r>
+        <w:t xml:space="preserve"> </w:t>
+      </w:r>
+      <w:r>
+        <w:rPr>
+          <w:b/>
+          <w:bCs/>
+        </w:rPr>
+        <w:t xml:space="preserve">~TB/s</w:t>
+      </w:r>
+      <w:r>
+        <w:t xml:space="preserve"> </w:t>
+      </w:r>
+      <w:r>
+        <w:t xml:space="preserve">(NVSwitch aggregate), far</w:t>
       </w:r>
       <w:r>
         <w:t xml:space="preserve"> </w:t>

</xml_diff>